<commit_message>
refactor: split facade and subsystems
</commit_message>
<xml_diff>
--- a/Assignment04/Hospital_Admission_Project_Guide.docx
+++ b/Assignment04/Hospital_Admission_Project_Guide.docx
@@ -72,7 +72,7 @@
           </w:tcPr>
           <w:p>
             <w:pPr>
-              <w:spacing w:after="0"/>
+              <w:spacing w:after="0" w:line="252" w:lineRule="auto"/>
             </w:pPr>
             <w:r>
               <w:rPr>
@@ -91,7 +91,7 @@
           </w:tcPr>
           <w:p>
             <w:pPr>
-              <w:spacing w:after="0"/>
+              <w:spacing w:after="0" w:line="252" w:lineRule="auto"/>
             </w:pPr>
             <w:r>
               <w:rPr>
@@ -110,7 +110,7 @@
           </w:tcPr>
           <w:p>
             <w:pPr>
-              <w:spacing w:after="0"/>
+              <w:spacing w:after="0" w:line="252" w:lineRule="auto"/>
             </w:pPr>
             <w:r>
               <w:rPr>
@@ -276,7 +276,7 @@
               <w:rPr>
                 <w:sz w:val="16"/>
               </w:rPr>
-              <w:t>internal/admission/admission.go</w:t>
+              <w:t>internal/facades/intake.go</w:t>
             </w:r>
           </w:p>
         </w:tc>
@@ -329,7 +329,7 @@
               <w:rPr>
                 <w:sz w:val="16"/>
               </w:rPr>
-              <w:t>internal/admission/admission.go</w:t>
+              <w:t>internal/facades/admin.go</w:t>
             </w:r>
           </w:p>
         </w:tc>
@@ -382,7 +382,7 @@
               <w:rPr>
                 <w:sz w:val="16"/>
               </w:rPr>
-              <w:t>internal/insurance, internal/equipment, internal/pharmacy</w:t>
+              <w:t>internal/subsystema, internal/subsystemb, internal/subsystemc</w:t>
             </w:r>
           </w:p>
         </w:tc>
@@ -492,7 +492,7 @@
           </w:tcPr>
           <w:p>
             <w:pPr>
-              <w:spacing w:after="0"/>
+              <w:spacing w:after="0" w:line="252" w:lineRule="auto"/>
             </w:pPr>
             <w:r>
               <w:rPr>
@@ -511,7 +511,7 @@
           </w:tcPr>
           <w:p>
             <w:pPr>
-              <w:spacing w:after="0"/>
+              <w:spacing w:after="0" w:line="252" w:lineRule="auto"/>
             </w:pPr>
             <w:r>
               <w:rPr>
@@ -530,7 +530,7 @@
           </w:tcPr>
           <w:p>
             <w:pPr>
-              <w:spacing w:after="0"/>
+              <w:spacing w:after="0" w:line="252" w:lineRule="auto"/>
             </w:pPr>
             <w:r>
               <w:rPr>
@@ -939,7 +939,7 @@
           </w:tcPr>
           <w:p>
             <w:pPr>
-              <w:spacing w:after="0"/>
+              <w:spacing w:after="0" w:line="252" w:lineRule="auto"/>
             </w:pPr>
             <w:r>
               <w:rPr>
@@ -958,7 +958,7 @@
           </w:tcPr>
           <w:p>
             <w:pPr>
-              <w:spacing w:after="0"/>
+              <w:spacing w:after="0" w:line="252" w:lineRule="auto"/>
             </w:pPr>
             <w:r>
               <w:rPr>
@@ -977,7 +977,7 @@
           </w:tcPr>
           <w:p>
             <w:pPr>
-              <w:spacing w:after="0"/>
+              <w:spacing w:after="0" w:line="252" w:lineRule="auto"/>
             </w:pPr>
             <w:r>
               <w:rPr>
@@ -1298,7 +1298,7 @@
           </w:tcPr>
           <w:p>
             <w:pPr>
-              <w:spacing w:after="0"/>
+              <w:spacing w:after="0" w:line="252" w:lineRule="auto"/>
             </w:pPr>
             <w:r>
               <w:rPr>
@@ -1317,7 +1317,7 @@
           </w:tcPr>
           <w:p>
             <w:pPr>
-              <w:spacing w:after="0"/>
+              <w:spacing w:after="0" w:line="252" w:lineRule="auto"/>
             </w:pPr>
             <w:r>
               <w:rPr>
@@ -1336,7 +1336,7 @@
           </w:tcPr>
           <w:p>
             <w:pPr>
-              <w:spacing w:after="0"/>
+              <w:spacing w:after="0" w:line="252" w:lineRule="auto"/>
             </w:pPr>
             <w:r>
               <w:rPr>
@@ -1670,7 +1670,7 @@
           </w:tcPr>
           <w:p>
             <w:pPr>
-              <w:spacing w:after="0"/>
+              <w:spacing w:after="0" w:line="252" w:lineRule="auto"/>
             </w:pPr>
             <w:r>
               <w:rPr>
@@ -1689,7 +1689,7 @@
           </w:tcPr>
           <w:p>
             <w:pPr>
-              <w:spacing w:after="0"/>
+              <w:spacing w:after="0" w:line="252" w:lineRule="auto"/>
             </w:pPr>
             <w:r>
               <w:rPr>
@@ -1708,7 +1708,7 @@
           </w:tcPr>
           <w:p>
             <w:pPr>
-              <w:spacing w:after="0"/>
+              <w:spacing w:after="0" w:line="252" w:lineRule="auto"/>
             </w:pPr>
             <w:r>
               <w:rPr>
@@ -1928,7 +1928,7 @@
           </w:tcPr>
           <w:p>
             <w:pPr>
-              <w:spacing w:after="0"/>
+              <w:spacing w:after="0" w:line="252" w:lineRule="auto"/>
             </w:pPr>
             <w:r>
               <w:rPr>
@@ -1947,7 +1947,7 @@
           </w:tcPr>
           <w:p>
             <w:pPr>
-              <w:spacing w:after="0"/>
+              <w:spacing w:after="0" w:line="252" w:lineRule="auto"/>
             </w:pPr>
             <w:r>
               <w:rPr>
@@ -1966,7 +1966,7 @@
           </w:tcPr>
           <w:p>
             <w:pPr>
-              <w:spacing w:after="0"/>
+              <w:spacing w:after="0" w:line="252" w:lineRule="auto"/>
             </w:pPr>
             <w:r>
               <w:rPr>
@@ -2353,7 +2353,7 @@
           </w:tcPr>
           <w:p>
             <w:pPr>
-              <w:spacing w:after="0"/>
+              <w:spacing w:after="0" w:line="252" w:lineRule="auto"/>
             </w:pPr>
             <w:r>
               <w:rPr>
@@ -2372,7 +2372,7 @@
           </w:tcPr>
           <w:p>
             <w:pPr>
-              <w:spacing w:after="0"/>
+              <w:spacing w:after="0" w:line="252" w:lineRule="auto"/>
             </w:pPr>
             <w:r>
               <w:rPr>
@@ -2391,7 +2391,7 @@
           </w:tcPr>
           <w:p>
             <w:pPr>
-              <w:spacing w:after="0"/>
+              <w:spacing w:after="0" w:line="252" w:lineRule="auto"/>
             </w:pPr>
             <w:r>
               <w:rPr>
@@ -2778,7 +2778,7 @@
           </w:tcPr>
           <w:p>
             <w:pPr>
-              <w:spacing w:after="0"/>
+              <w:spacing w:after="0" w:line="252" w:lineRule="auto"/>
             </w:pPr>
             <w:r>
               <w:rPr>
@@ -2797,7 +2797,7 @@
           </w:tcPr>
           <w:p>
             <w:pPr>
-              <w:spacing w:after="0"/>
+              <w:spacing w:after="0" w:line="252" w:lineRule="auto"/>
             </w:pPr>
             <w:r>
               <w:rPr>
@@ -2816,7 +2816,7 @@
           </w:tcPr>
           <w:p>
             <w:pPr>
-              <w:spacing w:after="0"/>
+              <w:spacing w:after="0" w:line="252" w:lineRule="auto"/>
             </w:pPr>
             <w:r>
               <w:rPr>
@@ -3162,7 +3162,7 @@
           </w:tcPr>
           <w:p>
             <w:pPr>
-              <w:spacing w:after="0"/>
+              <w:spacing w:after="0" w:line="252" w:lineRule="auto"/>
             </w:pPr>
             <w:r>
               <w:rPr>
@@ -3181,7 +3181,7 @@
           </w:tcPr>
           <w:p>
             <w:pPr>
-              <w:spacing w:after="0"/>
+              <w:spacing w:after="0" w:line="252" w:lineRule="auto"/>
             </w:pPr>
             <w:r>
               <w:rPr>
@@ -3296,7 +3296,7 @@
               <w:rPr>
                 <w:sz w:val="16"/>
               </w:rPr>
-              <w:t>internal/admission/admission.go</w:t>
+              <w:t>internal/facades/intake.go; internal/facades/admin.go</w:t>
             </w:r>
           </w:p>
         </w:tc>
@@ -3332,7 +3332,7 @@
               <w:rPr>
                 <w:sz w:val="16"/>
               </w:rPr>
-              <w:t>internal/insurance/insurance.go; internal/equipment/equipment.go; internal/pharmacy/pharmacy.go</w:t>
+              <w:t>internal/subsystema/insurance.go; internal/subsystemb/equipment.go; internal/subsystemc/pharmacy.go</w:t>
             </w:r>
           </w:p>
         </w:tc>
@@ -3440,7 +3440,7 @@
               <w:rPr>
                 <w:sz w:val="16"/>
               </w:rPr>
-              <w:t>uml.svg; internal/admission/admission_test.go; server_test.go</w:t>
+              <w:t>uml.svg; internal/facades/facades_test.go; server_test.go</w:t>
             </w:r>
           </w:p>
         </w:tc>

</xml_diff>

<commit_message>
refactor: name subsystem packages
</commit_message>
<xml_diff>
--- a/Assignment04/Hospital_Admission_Project_Guide.docx
+++ b/Assignment04/Hospital_Admission_Project_Guide.docx
@@ -382,7 +382,11 @@
               <w:rPr>
                 <w:sz w:val="16"/>
               </w:rPr>
-              <w:t>internal/subsystema, internal/subsystemb, internal/subsystemc</w:t>
+              <w:t>insuranceverifier</w:t>
+              <w:br/>
+              <w:t>equipmentreserver</w:t>
+              <w:br/>
+              <w:t>pharmacydispatcher</w:t>
             </w:r>
           </w:p>
         </w:tc>
@@ -3332,7 +3336,7 @@
               <w:rPr>
                 <w:sz w:val="16"/>
               </w:rPr>
-              <w:t>internal/subsystema/insurance.go; internal/subsystemb/equipment.go; internal/subsystemc/pharmacy.go</w:t>
+              <w:t>internal/insuranceverifier/insurance.go; internal/equipmentreserver/equipment.go; internal/pharmacydispatcher/pharmacy.go</w:t>
             </w:r>
           </w:p>
         </w:tc>

</xml_diff>

<commit_message>
refactor: drop coverage migration
</commit_message>
<xml_diff>
--- a/Assignment04/Hospital_Admission_Project_Guide.docx
+++ b/Assignment04/Hospital_Admission_Project_Guide.docx
@@ -415,14 +415,8 @@
             <w:vAlign w:val="top"/>
           </w:tcPr>
           <w:p>
-            <w:pPr>
-              <w:spacing w:after="0" w:line="252" w:lineRule="auto"/>
-            </w:pPr>
             <w:r>
-              <w:rPr>
-                <w:sz w:val="16"/>
-              </w:rPr>
-              <w:t>Opens SQLite, creates tables and initial stock, and migrates old policy columns.</w:t>
+              <w:t>Opens SQLite, creates tables, and adds initial stock.</w:t>
             </w:r>
           </w:p>
         </w:tc>
@@ -1237,7 +1231,7 @@
     </w:p>
     <w:p>
       <w:r>
-        <w:t>When an older database contains a policy column in admissions or insurance, startup renames that column to coverage and preserves the existing values. The UI labels values outside the new choices as Legacy. The project does not assign a new coverage category to those historical records.</w:t>
+        <w:t>The current schema uses coverage columns in admissions and insurance. Use a new database file for a fresh installation; this version does not alter older table layouts.</w:t>
       </w:r>
     </w:p>
     <w:p>
@@ -3011,7 +3005,7 @@
     </w:p>
     <w:p>
       <w:r>
-        <w:t>The automated tests use temporary SQLite files so cases are isolated and repeatable. They cover a successful chain, B and C failures, persisted statuses, a close and reopen during a pending chain, direct subsystem use, illegal transitions, coverage choices, old column migration, and HTTP behavior. Run go test ./... for the suite. The checked in coverage profile reports 81.5 percent statement coverage for the internal subsystem and facade packages combined.</w:t>
+        <w:t>The automated tests use temporary SQLite files so cases are isolated and repeatable. They cover a successful chain, B and C failures, persisted statuses, a close and reopen during a pending chain, direct subsystem use, illegal transitions, coverage choices, and HTTP behavior. Run go test ./... for the suite. The checked in coverage profile reports 82.7 percent statement coverage for the internal subsystem and facade packages combined.</w:t>
       </w:r>
     </w:p>
     <w:p>

</xml_diff>

<commit_message>
feat: add stepwise admission and release
</commit_message>
<xml_diff>
--- a/Assignment04/Hospital_Admission_Project_Guide.docx
+++ b/Assignment04/Hospital_Admission_Project_Guide.docx
@@ -146,14 +146,8 @@
             <w:vAlign w:val="top"/>
           </w:tcPr>
           <w:p>
-            <w:pPr>
-              <w:spacing w:after="0" w:line="252" w:lineRule="auto"/>
-            </w:pPr>
             <w:r>
-              <w:rPr>
-                <w:sz w:val="16"/>
-              </w:rPr>
-              <w:t>Bootstrap page for admission, inspection, stock edits, resume, and manual compensation.</w:t>
+              <w:t>Bootstrap page for full and stepwise admission, stock edits, compensation, and release.</w:t>
             </w:r>
           </w:p>
         </w:tc>
@@ -252,14 +246,8 @@
             <w:vAlign w:val="top"/>
           </w:tcPr>
           <w:p>
-            <w:pPr>
-              <w:spacing w:after="0" w:line="252" w:lineRule="auto"/>
-            </w:pPr>
             <w:r>
-              <w:rPr>
-                <w:sz w:val="16"/>
-              </w:rPr>
-              <w:t>Owns the A to B to C order, durable progress, resume, and reverse order compensation.</w:t>
+              <w:t>Owns A to B to C order, individual steps, resume, and reverse order compensation.</w:t>
             </w:r>
           </w:p>
         </w:tc>
@@ -305,14 +293,8 @@
             <w:vAlign w:val="top"/>
           </w:tcPr>
           <w:p>
-            <w:pPr>
-              <w:spacing w:after="0" w:line="252" w:lineRule="auto"/>
-            </w:pPr>
             <w:r>
-              <w:rPr>
-                <w:sz w:val="16"/>
-              </w:rPr>
-              <w:t>Reads combined state and guards manual compensation.</w:t>
+              <w:t>Reads combined state and handles manual compensation and completed release.</w:t>
             </w:r>
           </w:p>
         </w:tc>
@@ -854,7 +836,7 @@
     </w:p>
     <w:p>
       <w:r>
-        <w:t>Dispatch is the C step. Its rule requires a nonempty medicine name. Dispatch executes a transaction that decrements one pharmacy stock unit only when quantity is greater than zero, then inserts a row with status DISPATCHED. The entity defines NEW, DISPATCHED, and CANCELLED transitions, but the current service does not expose a cancel operation. Completed medicine dispatch is therefore not automatically reversed, and the admin facade refuses manual compensation once medicine is dispatched.</w:t>
+        <w:t>Dispatch is the C step. Its rule requires a nonempty medicine name. Dispatch uses a transaction to deduct one pharmacy stock unit and save DISPATCHED. Cancel changes an active dispatch to CANCELLED and returns one unit to pharmacy stock in one transaction. The entity permits NEW to DISPATCHED to CANCELLED. This cancellation is a simplified local stock reversal.</w:t>
       </w:r>
     </w:p>
     <w:p>
@@ -1500,14 +1482,8 @@
             <w:vAlign w:val="top"/>
           </w:tcPr>
           <w:p>
-            <w:pPr>
-              <w:spacing w:after="0" w:line="252" w:lineRule="auto"/>
-            </w:pPr>
             <w:r>
-              <w:rPr>
-                <w:sz w:val="16"/>
-              </w:rPr>
-              <w:t>Resume calls Equipment.Reserve, or recognizes an already RESERVED row.</w:t>
+              <w:t>Reserve equipment calls IntakeFacade.Reserve, or Complete all calls it during Resume.</w:t>
             </w:r>
           </w:p>
         </w:tc>
@@ -1553,14 +1529,8 @@
             <w:vAlign w:val="top"/>
           </w:tcPr>
           <w:p>
-            <w:pPr>
-              <w:spacing w:after="0" w:line="252" w:lineRule="auto"/>
-            </w:pPr>
             <w:r>
-              <w:rPr>
-                <w:sz w:val="16"/>
-              </w:rPr>
-              <w:t>Resume calls Pharmacy.Dispatch, or recognizes an already DISPATCHED row.</w:t>
+              <w:t>Dispatch medicine calls IntakeFacade.Dispatch, or Complete all calls it during Resume.</w:t>
             </w:r>
           </w:p>
         </w:tc>
@@ -1590,7 +1560,7 @@
     </w:p>
     <w:p>
       <w:r>
-        <w:t>The common web Admit button calls IntakeFacade.Admit, which runs Start and then Resume. Verify only calls Start and leaves the admission at PENDING_B. The Resume button continues the remaining steps. The facade reads persisted rows before retrying a step, so a restart after a committed operation does not automatically repeat that operation.</w:t>
+        <w:t>Admit all calls IntakeFacade.Admit and performs A, B, and C in order. Verify insurance calls Start and stops at PENDING_B. Reserve equipment and Dispatch medicine perform B and C separately on the saved admission. Complete all continues every remaining step. The facade checks persisted rows before retrying, so a restart after a committed operation does not deduct stock twice.</w:t>
       </w:r>
     </w:p>
     <w:p>
@@ -1856,7 +1826,7 @@
     </w:p>
     <w:p>
       <w:r>
-        <w:t>Compensation is not a single SQLite transaction across all steps. Each subsystem operation is saved separately, and the facade uses compensating actions in reverse order when a later step fails. The failure reason is kept in admissions.reason. If compensation itself fails, the admission can remain COMPENSATING; Resume retries the remaining reversals from persisted state.</w:t>
+        <w:t>Compensation is not a single SQLite transaction across all steps. Each subsystem operation is saved separately. When a step fails or a completed admission is released, the facade reverses committed work in order: cancel pharmacy dispatch, release equipment, then reverse insurance. The reason is kept in admissions.reason. If compensation stops midway, the admission remains COMPENSATING and Complete all retries the remaining reversals from persisted state.</w:t>
       </w:r>
     </w:p>
     <w:p>
@@ -2147,14 +2117,8 @@
             <w:vAlign w:val="top"/>
           </w:tcPr>
           <w:p>
-            <w:pPr>
-              <w:spacing w:after="0" w:line="252" w:lineRule="auto"/>
-            </w:pPr>
             <w:r>
-              <w:rPr>
-                <w:sz w:val="16"/>
-              </w:rPr>
-              <w:t>Resume returns successfully without repeating work.</w:t>
+              <w:t>Release admission reverses all three steps.</w:t>
             </w:r>
           </w:p>
         </w:tc>
@@ -2200,14 +2164,8 @@
             <w:vAlign w:val="top"/>
           </w:tcPr>
           <w:p>
-            <w:pPr>
-              <w:spacing w:after="0" w:line="252" w:lineRule="auto"/>
-            </w:pPr>
             <w:r>
-              <w:rPr>
-                <w:sz w:val="16"/>
-              </w:rPr>
-              <w:t>Resume retries release of B and reversal of A where still needed.</w:t>
+              <w:t>Complete all retries cancellation of C, release of B, and reversal of A.</w:t>
             </w:r>
           </w:p>
         </w:tc>
@@ -2236,14 +2194,8 @@
             <w:vAlign w:val="top"/>
           </w:tcPr>
           <w:p>
-            <w:pPr>
-              <w:spacing w:after="0" w:line="252" w:lineRule="auto"/>
-            </w:pPr>
             <w:r>
-              <w:rPr>
-                <w:sz w:val="16"/>
-              </w:rPr>
-              <w:t>Earlier committed work has been reversed.</w:t>
+              <w:t>Committed work has been reversed.</w:t>
             </w:r>
           </w:p>
         </w:tc>
@@ -2286,7 +2238,7 @@
     </w:p>
     <w:p>
       <w:r>
-        <w:t>AdminFacade.Inspect loads the admission and each subsystem row, returning NONE for a subsystem that has no row. AdminFacade.Compensate supports a manual reverse of an incomplete admission. It refuses a COMPLETED admission or any admission with DISPATCHED pharmacy state. Calling it on an already COMPENSATED admission is harmless. The web detail panel enables Resume only for pending or compensating states and disables Compensate for completed, compensated, or dispatched cases.</w:t>
+        <w:t>AdminFacade.Inspect loads the admission and each subsystem row, returning NONE when a subsystem has no row. AdminFacade.Compensate reverses an incomplete admission. AdminFacade.Release accepts a completed admission and undoes all three steps, restoring equipment and medicine stock. A completed release ends as COMPENSATED with pharmacy CANCELLED, equipment RELEASED, and insurance REVERSED. Complete all can finish an interrupted reversal.</w:t>
       </w:r>
     </w:p>
     <w:p>
@@ -2372,13 +2324,7 @@
             <w:vAlign w:val="top"/>
           </w:tcPr>
           <w:p>
-            <w:pPr>
-              <w:spacing w:after="0" w:line="252" w:lineRule="auto"/>
-            </w:pPr>
             <w:r>
-              <w:rPr>
-                <w:sz w:val="16"/>
-              </w:rPr>
               <w:t>Full admission</w:t>
             </w:r>
           </w:p>
@@ -2389,14 +2335,8 @@
             <w:vAlign w:val="top"/>
           </w:tcPr>
           <w:p>
-            <w:pPr>
-              <w:spacing w:after="0" w:line="252" w:lineRule="auto"/>
-            </w:pPr>
             <w:r>
-              <w:rPr>
-                <w:sz w:val="16"/>
-              </w:rPr>
-              <w:t>Admit button; POST /api/admissions with action admit.</w:t>
+              <w:t>Admit all; POST /api/admissions with action admit.</w:t>
             </w:r>
           </w:p>
         </w:tc>
@@ -2419,14 +2359,8 @@
             <w:vAlign w:val="top"/>
           </w:tcPr>
           <w:p>
-            <w:pPr>
-              <w:spacing w:after="0" w:line="252" w:lineRule="auto"/>
-            </w:pPr>
             <w:r>
-              <w:rPr>
-                <w:sz w:val="16"/>
-              </w:rPr>
-              <w:t>Only stage A</w:t>
+              <w:t>Verify insurance</w:t>
             </w:r>
           </w:p>
         </w:tc>
@@ -2436,14 +2370,8 @@
             <w:vAlign w:val="top"/>
           </w:tcPr>
           <w:p>
-            <w:pPr>
-              <w:spacing w:after="0" w:line="252" w:lineRule="auto"/>
-            </w:pPr>
             <w:r>
-              <w:rPr>
-                <w:sz w:val="16"/>
-              </w:rPr>
-              <w:t>Verify only button; POST /api/admissions with action start.</w:t>
+              <w:t>Verify insurance; POST /api/admissions with action start.</w:t>
             </w:r>
           </w:p>
         </w:tc>
@@ -2454,7 +2382,7 @@
           </w:tcPr>
           <w:p>
             <w:r>
-              <w:t>Verifies insurance and leaves the admission at PENDING_B.</w:t>
+              <w:t>Leaves the admission at PENDING_B.</w:t>
             </w:r>
           </w:p>
         </w:tc>
@@ -2466,14 +2394,8 @@
             <w:vAlign w:val="top"/>
           </w:tcPr>
           <w:p>
-            <w:pPr>
-              <w:spacing w:after="0" w:line="252" w:lineRule="auto"/>
-            </w:pPr>
             <w:r>
-              <w:rPr>
-                <w:sz w:val="16"/>
-              </w:rPr>
-              <w:t>Continue</w:t>
+              <w:t>Reserve equipment</w:t>
             </w:r>
           </w:p>
         </w:tc>
@@ -2483,14 +2405,8 @@
             <w:vAlign w:val="top"/>
           </w:tcPr>
           <w:p>
-            <w:pPr>
-              <w:spacing w:after="0" w:line="252" w:lineRule="auto"/>
-            </w:pPr>
             <w:r>
-              <w:rPr>
-                <w:sz w:val="16"/>
-              </w:rPr>
-              <w:t>Resume button; POST /api/admissions/{id}/resume.</w:t>
+              <w:t>Reserve equipment; POST /api/admissions/{id}/reserve.</w:t>
             </w:r>
           </w:p>
         </w:tc>
@@ -2501,7 +2417,7 @@
           </w:tcPr>
           <w:p>
             <w:r>
-              <w:t>Continues a pending admission from saved state.</w:t>
+              <w:t>Deducts one equipment unit and moves to PENDING_C.</w:t>
             </w:r>
           </w:p>
         </w:tc>
@@ -2513,13 +2429,77 @@
             <w:vAlign w:val="top"/>
           </w:tcPr>
           <w:p>
-            <w:pPr>
-              <w:spacing w:after="0" w:line="252" w:lineRule="auto"/>
-            </w:pPr>
             <w:r>
-              <w:rPr>
-                <w:sz w:val="16"/>
-              </w:rPr>
+              <w:t>Dispatch medicine</w:t>
+            </w:r>
+          </w:p>
+        </w:tc>
+        <w:tc>
+          <w:tcPr>
+            <w:tcW w:type="dxa" w:w="4968"/>
+            <w:vAlign w:val="top"/>
+          </w:tcPr>
+          <w:p>
+            <w:r>
+              <w:t>Dispatch medicine; POST /api/admissions/{id}/dispatch.</w:t>
+            </w:r>
+          </w:p>
+        </w:tc>
+        <w:tc>
+          <w:tcPr>
+            <w:tcW w:type="dxa" w:w="3240"/>
+            <w:vAlign w:val="top"/>
+          </w:tcPr>
+          <w:p>
+            <w:r>
+              <w:t>Deducts one medicine unit and completes the admission.</w:t>
+            </w:r>
+          </w:p>
+        </w:tc>
+      </w:tr>
+      <w:tr>
+        <w:tc>
+          <w:tcPr>
+            <w:tcW w:type="dxa" w:w="1656"/>
+            <w:vAlign w:val="top"/>
+          </w:tcPr>
+          <w:p>
+            <w:r>
+              <w:t>Continue all</w:t>
+            </w:r>
+          </w:p>
+        </w:tc>
+        <w:tc>
+          <w:tcPr>
+            <w:tcW w:type="dxa" w:w="4968"/>
+            <w:vAlign w:val="top"/>
+          </w:tcPr>
+          <w:p>
+            <w:r>
+              <w:t>Complete all; POST /api/admissions/{id}/resume.</w:t>
+            </w:r>
+          </w:p>
+        </w:tc>
+        <w:tc>
+          <w:tcPr>
+            <w:tcW w:type="dxa" w:w="3240"/>
+            <w:vAlign w:val="top"/>
+          </w:tcPr>
+          <w:p>
+            <w:r>
+              <w:t>Continues the remaining steps or an interrupted reversal.</w:t>
+            </w:r>
+          </w:p>
+        </w:tc>
+      </w:tr>
+      <w:tr>
+        <w:tc>
+          <w:tcPr>
+            <w:tcW w:type="dxa" w:w="1656"/>
+            <w:vAlign w:val="top"/>
+          </w:tcPr>
+          <w:p>
+            <w:r>
               <w:t>Inspect</w:t>
             </w:r>
           </w:p>
@@ -2530,14 +2510,8 @@
             <w:vAlign w:val="top"/>
           </w:tcPr>
           <w:p>
-            <w:pPr>
-              <w:spacing w:after="0" w:line="252" w:lineRule="auto"/>
-            </w:pPr>
             <w:r>
-              <w:rPr>
-                <w:sz w:val="16"/>
-              </w:rPr>
-              <w:t>Admissions table and View button; GET /api/state or GET /api/admissions/{id}.</w:t>
+              <w:t>Admissions table and View; GET /api/state or GET /api/admissions/{id}.</w:t>
             </w:r>
           </w:p>
         </w:tc>
@@ -2557,16 +2531,9 @@
         <w:tc>
           <w:tcPr>
             <w:tcW w:type="dxa" w:w="1656"/>
-            <w:vAlign w:val="top"/>
           </w:tcPr>
           <w:p>
-            <w:pPr>
-              <w:spacing w:after="0" w:line="252" w:lineRule="auto"/>
-            </w:pPr>
             <w:r>
-              <w:rPr>
-                <w:sz w:val="16"/>
-              </w:rPr>
               <w:t>Manual reverse</w:t>
             </w:r>
           </w:p>
@@ -2574,28 +2541,20 @@
         <w:tc>
           <w:tcPr>
             <w:tcW w:type="dxa" w:w="4968"/>
-            <w:vAlign w:val="top"/>
           </w:tcPr>
           <w:p>
-            <w:pPr>
-              <w:spacing w:after="0" w:line="252" w:lineRule="auto"/>
-            </w:pPr>
             <w:r>
-              <w:rPr>
-                <w:sz w:val="16"/>
-              </w:rPr>
-              <w:t>Compensate button; POST /api/admissions/{id}/compensate.</w:t>
+              <w:t>Compensate; POST /api/admissions/{id}/compensate.</w:t>
             </w:r>
           </w:p>
         </w:tc>
         <w:tc>
           <w:tcPr>
             <w:tcW w:type="dxa" w:w="3240"/>
-            <w:vAlign w:val="top"/>
           </w:tcPr>
           <w:p>
             <w:r>
-              <w:t>Reverses an incomplete admission when allowed.</w:t>
+              <w:t>Reverses an incomplete admission.</w:t>
             </w:r>
           </w:p>
         </w:tc>
@@ -2604,16 +2563,41 @@
         <w:tc>
           <w:tcPr>
             <w:tcW w:type="dxa" w:w="1656"/>
-            <w:vAlign w:val="top"/>
           </w:tcPr>
           <w:p>
-            <w:pPr>
-              <w:spacing w:after="0" w:line="252" w:lineRule="auto"/>
-            </w:pPr>
             <w:r>
-              <w:rPr>
-                <w:sz w:val="16"/>
-              </w:rPr>
+              <w:t>Release completed</w:t>
+            </w:r>
+          </w:p>
+        </w:tc>
+        <w:tc>
+          <w:tcPr>
+            <w:tcW w:type="dxa" w:w="4968"/>
+          </w:tcPr>
+          <w:p>
+            <w:r>
+              <w:t>Release admission; POST /api/admissions/{id}/release.</w:t>
+            </w:r>
+          </w:p>
+        </w:tc>
+        <w:tc>
+          <w:tcPr>
+            <w:tcW w:type="dxa" w:w="3240"/>
+          </w:tcPr>
+          <w:p>
+            <w:r>
+              <w:t>Cancels pharmacy, releases equipment, and reverses insurance.</w:t>
+            </w:r>
+          </w:p>
+        </w:tc>
+      </w:tr>
+      <w:tr>
+        <w:tc>
+          <w:tcPr>
+            <w:tcW w:type="dxa" w:w="1656"/>
+          </w:tcPr>
+          <w:p>
+            <w:r>
               <w:t>Set stock</w:t>
             </w:r>
           </w:p>
@@ -2621,16 +2605,9 @@
         <w:tc>
           <w:tcPr>
             <w:tcW w:type="dxa" w:w="4968"/>
-            <w:vAlign w:val="top"/>
           </w:tcPr>
           <w:p>
-            <w:pPr>
-              <w:spacing w:after="0" w:line="252" w:lineRule="auto"/>
-            </w:pPr>
             <w:r>
-              <w:rPr>
-                <w:sz w:val="16"/>
-              </w:rPr>
               <w:t>Stock tab; POST /api/stock.</w:t>
             </w:r>
           </w:p>
@@ -2638,7 +2615,6 @@
         <w:tc>
           <w:tcPr>
             <w:tcW w:type="dxa" w:w="3240"/>
-            <w:vAlign w:val="top"/>
           </w:tcPr>
           <w:p>
             <w:r>
@@ -2661,6 +2637,7 @@
     <w:p>
       <w:pPr>
         <w:pStyle w:val="Heading1"/>
+        <w:pageBreakBefore/>
       </w:pPr>
       <w:r>
         <w:t>Run and demonstrate</w:t>
@@ -2920,14 +2897,8 @@
             <w:vAlign w:val="top"/>
           </w:tcPr>
           <w:p>
-            <w:pPr>
-              <w:spacing w:after="0" w:line="252" w:lineRule="auto"/>
-            </w:pPr>
             <w:r>
-              <w:rPr>
-                <w:sz w:val="16"/>
-              </w:rPr>
-              <w:t>Restart</w:t>
+              <w:t>Release</w:t>
             </w:r>
           </w:p>
         </w:tc>
@@ -2937,14 +2908,8 @@
             <w:vAlign w:val="top"/>
           </w:tcPr>
           <w:p>
-            <w:pPr>
-              <w:spacing w:after="0" w:line="252" w:lineRule="auto"/>
-            </w:pPr>
             <w:r>
-              <w:rPr>
-                <w:sz w:val="16"/>
-              </w:rPr>
-              <w:t>Use Verify only, stop the server, restart with the same file, then Resume.</w:t>
+              <w:t>Complete an admission, then click Release admission.</w:t>
             </w:r>
           </w:p>
         </w:tc>
@@ -2954,14 +2919,40 @@
             <w:vAlign w:val="top"/>
           </w:tcPr>
           <w:p>
-            <w:pPr>
-              <w:spacing w:after="0" w:line="252" w:lineRule="auto"/>
-            </w:pPr>
             <w:r>
-              <w:rPr>
-                <w:sz w:val="16"/>
-              </w:rPr>
-              <w:t>Previously saved PENDING_B continues to COMPLETED if stock is available.</w:t>
+              <w:t>COMPENSATED; pharmacy CANCELLED, equipment RELEASED, insurance REVERSED; both stock counts restored.</w:t>
+            </w:r>
+          </w:p>
+        </w:tc>
+      </w:tr>
+      <w:tr>
+        <w:tc>
+          <w:tcPr>
+            <w:tcW w:type="dxa" w:w="1512"/>
+          </w:tcPr>
+          <w:p>
+            <w:r>
+              <w:t>Restart</w:t>
+            </w:r>
+          </w:p>
+        </w:tc>
+        <w:tc>
+          <w:tcPr>
+            <w:tcW w:type="dxa" w:w="4608"/>
+          </w:tcPr>
+          <w:p>
+            <w:r>
+              <w:t>Use Verify insurance, stop the server, restart with the same file, then Complete all.</w:t>
+            </w:r>
+          </w:p>
+        </w:tc>
+        <w:tc>
+          <w:tcPr>
+            <w:tcW w:type="dxa" w:w="3744"/>
+          </w:tcPr>
+          <w:p>
+            <w:r>
+              <w:t>Saved PENDING_B continues to COMPLETED if stock is available.</w:t>
             </w:r>
           </w:p>
         </w:tc>
@@ -2987,7 +2978,7 @@
     </w:p>
     <w:p>
       <w:r>
-        <w:t>A client without the facade would have to call Insurance.Verify, then Equipment.Reserve, then Pharmacy.Dispatch, remember which calls had committed, and reverse earlier results in the right order if a later call failed. With IntakeFacade.Admit, the client has one operation for the normal workflow. AdminFacade offers a smaller inspection and manual recovery interface. This follows the Principle of Least Knowledge: the web handler does not coordinate the three repositories itself.</w:t>
+        <w:t>A client without the facade would have to call Insurance.Verify, Equipment.Reserve, and Pharmacy.Dispatch in order, track completed work, and reverse it when required. IntakeFacade.Admit gives the web handler one operation for the normal workflow. IntakeFacade also exposes Reserve and Dispatch for stepwise operation. AdminFacade provides inspection, compensation, and completed admission release.</w:t>
       </w:r>
     </w:p>
     <w:p>
@@ -3005,7 +2996,7 @@
     </w:p>
     <w:p>
       <w:r>
-        <w:t>The automated tests use temporary SQLite files so cases are isolated and repeatable. They cover a successful chain, B and C failures, persisted statuses, a close and reopen during a pending chain, direct subsystem use, illegal transitions, coverage choices, and HTTP behavior. Run go test ./... for the suite. The checked in coverage profile reports 82.7 percent statement coverage for the internal subsystem and facade packages combined.</w:t>
+        <w:t>The automated tests use temporary SQLite files so cases are isolated and repeatable. They cover full and stepwise admissions, B and C failures, release and stock restoration, interrupted compensation, persisted statuses, coverage choices, and HTTP behavior. Run go test ./... for the suite. The checked in coverage profile reports 80.6 percent statement coverage for the internal packages combined.</w:t>
       </w:r>
     </w:p>
     <w:p>
@@ -3037,7 +3028,7 @@
         <w:pStyle w:val="ListBullet"/>
       </w:pPr>
       <w:r>
-        <w:t>Pharmacy dispatch is treated as final in the current workflow. The CANCELLED entity transition has no exposed service method.</w:t>
+        <w:t>Pharmacy cancellation restores a stock count in this teaching model. A real dispatched medicine may not be returnable, so a real hospital would need a different clinical and inventory process.</w:t>
       </w:r>
     </w:p>
     <w:p>
@@ -3056,322 +3047,6 @@
         <w:t>A generated web ID has a very low chance of collision; admissions.id is the database uniqueness guard. The code does not retry after a collision.</w:t>
       </w:r>
     </w:p>
-    <w:p>
-      <w:pPr>
-        <w:pStyle w:val="Heading1"/>
-      </w:pPr>
-      <w:r>
-        <w:t>Source map</w:t>
-      </w:r>
-    </w:p>
-    <w:tbl>
-      <w:tblPr>
-        <w:tblStyle w:val="TableGrid"/>
-        <w:tblW w:type="auto" w:w="0"/>
-        <w:jc w:val="center"/>
-        <w:tblLayout w:type="fixed"/>
-        <w:tblLook w:firstColumn="1" w:firstRow="1" w:lastColumn="0" w:lastRow="0" w:noHBand="0" w:noVBand="1" w:val="04A0"/>
-      </w:tblPr>
-      <w:tblGrid>
-        <w:gridCol w:w="3888"/>
-        <w:gridCol w:w="5976"/>
-      </w:tblGrid>
-      <w:tr>
-        <w:trPr>
-          <w:tblHeader w:val="true"/>
-        </w:trPr>
-        <w:tc>
-          <w:tcPr>
-            <w:tcW w:type="dxa" w:w="4997"/>
-            <w:shd w:fill="DDE6ED"/>
-            <w:vAlign w:val="center"/>
-          </w:tcPr>
-          <w:p>
-            <w:pPr>
-              <w:spacing w:after="0" w:line="252" w:lineRule="auto"/>
-            </w:pPr>
-            <w:r>
-              <w:rPr>
-                <w:b/>
-                <w:sz w:val="16"/>
-              </w:rPr>
-              <w:t>Question</w:t>
-            </w:r>
-          </w:p>
-        </w:tc>
-        <w:tc>
-          <w:tcPr>
-            <w:tcW w:type="dxa" w:w="4997"/>
-            <w:shd w:fill="DDE6ED"/>
-            <w:vAlign w:val="center"/>
-          </w:tcPr>
-          <w:p>
-            <w:pPr>
-              <w:spacing w:after="0" w:line="252" w:lineRule="auto"/>
-            </w:pPr>
-            <w:r>
-              <w:rPr>
-                <w:b/>
-                <w:sz w:val="16"/>
-              </w:rPr>
-              <w:t>File to inspect</w:t>
-            </w:r>
-          </w:p>
-        </w:tc>
-      </w:tr>
-      <w:tr>
-        <w:tc>
-          <w:tcPr>
-            <w:tcW w:type="dxa" w:w="3888"/>
-            <w:vAlign w:val="top"/>
-          </w:tcPr>
-          <w:p>
-            <w:pPr>
-              <w:spacing w:after="0" w:line="252" w:lineRule="auto"/>
-            </w:pPr>
-            <w:r>
-              <w:rPr>
-                <w:sz w:val="16"/>
-              </w:rPr>
-              <w:t>How the application is assembled and run</w:t>
-            </w:r>
-          </w:p>
-        </w:tc>
-        <w:tc>
-          <w:tcPr>
-            <w:tcW w:type="dxa" w:w="5976"/>
-            <w:vAlign w:val="top"/>
-          </w:tcPr>
-          <w:p>
-            <w:pPr>
-              <w:spacing w:after="0" w:line="252" w:lineRule="auto"/>
-            </w:pPr>
-            <w:r>
-              <w:rPr>
-                <w:sz w:val="16"/>
-              </w:rPr>
-              <w:t>main.go</w:t>
-            </w:r>
-          </w:p>
-        </w:tc>
-      </w:tr>
-      <w:tr>
-        <w:tc>
-          <w:tcPr>
-            <w:tcW w:type="dxa" w:w="3888"/>
-            <w:vAlign w:val="top"/>
-          </w:tcPr>
-          <w:p>
-            <w:pPr>
-              <w:spacing w:after="0" w:line="252" w:lineRule="auto"/>
-            </w:pPr>
-            <w:r>
-              <w:rPr>
-                <w:sz w:val="16"/>
-              </w:rPr>
-              <w:t>How HTTP requests and generated IDs work</w:t>
-            </w:r>
-          </w:p>
-        </w:tc>
-        <w:tc>
-          <w:tcPr>
-            <w:tcW w:type="dxa" w:w="5976"/>
-            <w:vAlign w:val="top"/>
-          </w:tcPr>
-          <w:p>
-            <w:pPr>
-              <w:spacing w:after="0" w:line="252" w:lineRule="auto"/>
-            </w:pPr>
-            <w:r>
-              <w:rPr>
-                <w:sz w:val="16"/>
-              </w:rPr>
-              <w:t>server.go</w:t>
-            </w:r>
-          </w:p>
-        </w:tc>
-      </w:tr>
-      <w:tr>
-        <w:tc>
-          <w:tcPr>
-            <w:tcW w:type="dxa" w:w="3888"/>
-            <w:vAlign w:val="top"/>
-          </w:tcPr>
-          <w:p>
-            <w:pPr>
-              <w:spacing w:after="0" w:line="252" w:lineRule="auto"/>
-            </w:pPr>
-            <w:r>
-              <w:rPr>
-                <w:sz w:val="16"/>
-              </w:rPr>
-              <w:t>How A, B, C, resume, and compensation work</w:t>
-            </w:r>
-          </w:p>
-        </w:tc>
-        <w:tc>
-          <w:tcPr>
-            <w:tcW w:type="dxa" w:w="5976"/>
-            <w:vAlign w:val="top"/>
-          </w:tcPr>
-          <w:p>
-            <w:pPr>
-              <w:spacing w:after="0" w:line="252" w:lineRule="auto"/>
-            </w:pPr>
-            <w:r>
-              <w:rPr>
-                <w:sz w:val="16"/>
-              </w:rPr>
-              <w:t>internal/facades/intake.go; internal/facades/admin.go</w:t>
-            </w:r>
-          </w:p>
-        </w:tc>
-      </w:tr>
-      <w:tr>
-        <w:tc>
-          <w:tcPr>
-            <w:tcW w:type="dxa" w:w="3888"/>
-            <w:vAlign w:val="top"/>
-          </w:tcPr>
-          <w:p>
-            <w:pPr>
-              <w:spacing w:after="0" w:line="252" w:lineRule="auto"/>
-            </w:pPr>
-            <w:r>
-              <w:rPr>
-                <w:sz w:val="16"/>
-              </w:rPr>
-              <w:t>How each subsystem validates and persists</w:t>
-            </w:r>
-          </w:p>
-        </w:tc>
-        <w:tc>
-          <w:tcPr>
-            <w:tcW w:type="dxa" w:w="5976"/>
-            <w:vAlign w:val="top"/>
-          </w:tcPr>
-          <w:p>
-            <w:pPr>
-              <w:spacing w:after="0" w:line="252" w:lineRule="auto"/>
-            </w:pPr>
-            <w:r>
-              <w:rPr>
-                <w:sz w:val="16"/>
-              </w:rPr>
-              <w:t>internal/insuranceverifier/insurance.go; internal/equipmentreserver/equipment.go; internal/pharmacydispatcher/pharmacy.go</w:t>
-            </w:r>
-          </w:p>
-        </w:tc>
-      </w:tr>
-      <w:tr>
-        <w:tc>
-          <w:tcPr>
-            <w:tcW w:type="dxa" w:w="3888"/>
-            <w:vAlign w:val="top"/>
-          </w:tcPr>
-          <w:p>
-            <w:pPr>
-              <w:spacing w:after="0" w:line="252" w:lineRule="auto"/>
-            </w:pPr>
-            <w:r>
-              <w:rPr>
-                <w:sz w:val="16"/>
-              </w:rPr>
-              <w:t>What SQLite tables exist</w:t>
-            </w:r>
-          </w:p>
-        </w:tc>
-        <w:tc>
-          <w:tcPr>
-            <w:tcW w:type="dxa" w:w="5976"/>
-            <w:vAlign w:val="top"/>
-          </w:tcPr>
-          <w:p>
-            <w:pPr>
-              <w:spacing w:after="0" w:line="252" w:lineRule="auto"/>
-            </w:pPr>
-            <w:r>
-              <w:rPr>
-                <w:sz w:val="16"/>
-              </w:rPr>
-              <w:t>internal/store/store.go</w:t>
-            </w:r>
-          </w:p>
-        </w:tc>
-      </w:tr>
-      <w:tr>
-        <w:tc>
-          <w:tcPr>
-            <w:tcW w:type="dxa" w:w="3888"/>
-            <w:vAlign w:val="top"/>
-          </w:tcPr>
-          <w:p>
-            <w:pPr>
-              <w:spacing w:after="0" w:line="252" w:lineRule="auto"/>
-            </w:pPr>
-            <w:r>
-              <w:rPr>
-                <w:sz w:val="16"/>
-              </w:rPr>
-              <w:t>How the web interface behaves</w:t>
-            </w:r>
-          </w:p>
-        </w:tc>
-        <w:tc>
-          <w:tcPr>
-            <w:tcW w:type="dxa" w:w="5976"/>
-            <w:vAlign w:val="top"/>
-          </w:tcPr>
-          <w:p>
-            <w:pPr>
-              <w:spacing w:after="0" w:line="252" w:lineRule="auto"/>
-            </w:pPr>
-            <w:r>
-              <w:rPr>
-                <w:sz w:val="16"/>
-              </w:rPr>
-              <w:t>web/index.html; web/app.js</w:t>
-            </w:r>
-          </w:p>
-        </w:tc>
-      </w:tr>
-      <w:tr>
-        <w:tc>
-          <w:tcPr>
-            <w:tcW w:type="dxa" w:w="3888"/>
-            <w:vAlign w:val="top"/>
-          </w:tcPr>
-          <w:p>
-            <w:pPr>
-              <w:spacing w:after="0" w:line="252" w:lineRule="auto"/>
-            </w:pPr>
-            <w:r>
-              <w:rPr>
-                <w:sz w:val="16"/>
-              </w:rPr>
-              <w:t>Where the class diagram and tests live</w:t>
-            </w:r>
-          </w:p>
-        </w:tc>
-        <w:tc>
-          <w:tcPr>
-            <w:tcW w:type="dxa" w:w="5976"/>
-            <w:vAlign w:val="top"/>
-          </w:tcPr>
-          <w:p>
-            <w:pPr>
-              <w:spacing w:after="0" w:line="252" w:lineRule="auto"/>
-            </w:pPr>
-            <w:r>
-              <w:rPr>
-                <w:sz w:val="16"/>
-              </w:rPr>
-              <w:t>uml.svg; internal/facades/facades_test.go; server_test.go</w:t>
-            </w:r>
-          </w:p>
-        </w:tc>
-      </w:tr>
-    </w:tbl>
     <w:p>
       <w:pPr>
         <w:spacing w:after="0"/>

</xml_diff>